<commit_message>
Reporte practica 2: capturas de la app en el celular
Ciclo real visto en el telefono (21:31-21:35): cerrada, notificaciones de
apertura y de puerta abierta, cerrada con el coche dentro (ToF a 73 mm) y
la notificacion de cierre recibida con la app en segundo plano.

Co-Authored-By: Claude Opus 5.5 <noreply@anthropic.com>
</commit_message>
<xml_diff>
--- a/docs/practica2/Reporte_Practica2_SmartGate_23310409_23310408.docx
+++ b/docs/practica2/Reporte_Practica2_SmartGate_23310409_23310408.docx
@@ -577,7 +577,7 @@
                 <w:b w:val="0"/>
                 <w:sz w:val="20"/>
               </w:rPr>
-              <w:t>Cliente en el navegador recibiendo una trama cada 500 ms (figura 8).</w:t>
+              <w:t>Cliente en el navegador recibiendo una trama cada 500 ms (figura 10).</w:t>
             </w:r>
           </w:p>
         </w:tc>
@@ -660,7 +660,7 @@
                 <w:b w:val="0"/>
                 <w:sz w:val="20"/>
               </w:rPr>
-              <w:t>Consolas de la ESP32, del gateway y de FastAPI; cliente WebSocket; app.</w:t>
+              <w:t>Consolas de la ESP32, del gateway y de FastAPI; cliente WebSocket; app en emulador y en el celular.</w:t>
             </w:r>
           </w:p>
         </w:tc>
@@ -2200,7 +2200,7 @@
       <w:r>
         <w:drawing>
           <wp:inline xmlns:a="http://schemas.openxmlformats.org/drawingml/2006/main" xmlns:pic="http://schemas.openxmlformats.org/drawingml/2006/picture">
-            <wp:extent cx="3840480" cy="4174435"/>
+            <wp:extent cx="2926080" cy="3180522"/>
             <wp:docPr id="3" name="Picture 3"/>
             <wp:cNvGraphicFramePr>
               <a:graphicFrameLocks noChangeAspect="1"/>
@@ -2221,7 +2221,7 @@
                   <pic:spPr>
                     <a:xfrm>
                       <a:off x="0" y="0"/>
-                      <a:ext cx="3840480" cy="4174435"/>
+                      <a:ext cx="2926080" cy="3180522"/>
                     </a:xfrm>
                     <a:prstGeom prst="rect"/>
                   </pic:spPr>
@@ -2238,6 +2238,110 @@
       </w:pPr>
       <w:r>
         <w:t>Figura 4. Izquierda: cerrándose. Derecha: después del ciclo, con el coche estacionado.</w:t>
+      </w:r>
+    </w:p>
+    <w:p>
+      <w:pPr/>
+      <w:r>
+        <w:t>Después instalamos el APK en el celular del equipo y lo conectamos al backend por la red WiFi (192.168.100.14:8000). Repetimos el ciclo con la maqueta y llegaron las tres notificaciones. Esta vez el carro quedó dentro del haz del ToF, que lo midió a 73 mm, y la app mostró «Hay coche dentro · El ToF lo detecta ahora». La notificación de cierre llegó con la app en segundo plano, lo que confirma que el servicio sigue escuchando aunque no esté abierta.</w:t>
+      </w:r>
+    </w:p>
+    <w:p>
+      <w:pPr>
+        <w:keepNext/>
+        <w:jc w:val="center"/>
+      </w:pPr>
+      <w:r/>
+      <w:r>
+        <w:drawing>
+          <wp:inline xmlns:a="http://schemas.openxmlformats.org/drawingml/2006/main" xmlns:pic="http://schemas.openxmlformats.org/drawingml/2006/picture">
+            <wp:extent cx="5943600" cy="3140831"/>
+            <wp:docPr id="4" name="Picture 4"/>
+            <wp:cNvGraphicFramePr>
+              <a:graphicFrameLocks noChangeAspect="1"/>
+            </wp:cNvGraphicFramePr>
+            <a:graphic>
+              <a:graphicData uri="http://schemas.openxmlformats.org/drawingml/2006/picture">
+                <pic:pic>
+                  <pic:nvPicPr>
+                    <pic:cNvPr id="0" name="celular_ciclo.jpg"/>
+                    <pic:cNvPicPr/>
+                  </pic:nvPicPr>
+                  <pic:blipFill>
+                    <a:blip r:embed="rId15"/>
+                    <a:stretch>
+                      <a:fillRect/>
+                    </a:stretch>
+                  </pic:blipFill>
+                  <pic:spPr>
+                    <a:xfrm>
+                      <a:off x="0" y="0"/>
+                      <a:ext cx="5943600" cy="3140831"/>
+                    </a:xfrm>
+                    <a:prstGeom prst="rect"/>
+                  </pic:spPr>
+                </pic:pic>
+              </a:graphicData>
+            </a:graphic>
+          </wp:inline>
+        </w:drawing>
+      </w:r>
+    </w:p>
+    <w:p>
+      <w:pPr>
+        <w:pStyle w:val="Caption"/>
+      </w:pPr>
+      <w:r>
+        <w:t>Figura 5. App en el celular, 25/10/2026 de 21:31 a 21:35: cerrada, notificación «Se está abriendo la cochera», notificación «La cochera está abierta» y cerrada con el coche dentro (ToF a 73 mm).</w:t>
+      </w:r>
+    </w:p>
+    <w:p>
+      <w:pPr>
+        <w:keepNext/>
+        <w:jc w:val="center"/>
+      </w:pPr>
+      <w:r/>
+      <w:r>
+        <w:drawing>
+          <wp:inline xmlns:a="http://schemas.openxmlformats.org/drawingml/2006/main" xmlns:pic="http://schemas.openxmlformats.org/drawingml/2006/picture">
+            <wp:extent cx="3291840" cy="1258906"/>
+            <wp:docPr id="5" name="Picture 5"/>
+            <wp:cNvGraphicFramePr>
+              <a:graphicFrameLocks noChangeAspect="1"/>
+            </wp:cNvGraphicFramePr>
+            <a:graphic>
+              <a:graphicData uri="http://schemas.openxmlformats.org/drawingml/2006/picture">
+                <pic:pic>
+                  <pic:nvPicPr>
+                    <pic:cNvPr id="0" name="celular_5_notificacion_cerrada.jpg"/>
+                    <pic:cNvPicPr/>
+                  </pic:nvPicPr>
+                  <pic:blipFill>
+                    <a:blip r:embed="rId16"/>
+                    <a:stretch>
+                      <a:fillRect/>
+                    </a:stretch>
+                  </pic:blipFill>
+                  <pic:spPr>
+                    <a:xfrm>
+                      <a:off x="0" y="0"/>
+                      <a:ext cx="3291840" cy="1258906"/>
+                    </a:xfrm>
+                    <a:prstGeom prst="rect"/>
+                  </pic:spPr>
+                </pic:pic>
+              </a:graphicData>
+            </a:graphic>
+          </wp:inline>
+        </w:drawing>
+      </w:r>
+    </w:p>
+    <w:p>
+      <w:pPr>
+        <w:pStyle w:val="Caption"/>
+      </w:pPr>
+      <w:r>
+        <w:t>Figura 6. Notificación «Se cerró la cochera» recibida con la app en segundo plano.</w:t>
       </w:r>
     </w:p>
     <w:p>
@@ -2788,7 +2892,7 @@
         <w:pStyle w:val="Caption"/>
       </w:pPr>
       <w:r>
-        <w:t>Figura 5. Consola serie de la ESP32 de la cochera (COM7, 25/10/2026): una línea por segundo con puerta, reed, ultrasónico, ToF y servo. El JSON sale por UART2 hacia el gateway.</w:t>
+        <w:t>Figura 7. Consola serie de la ESP32 de la cochera (COM7, 25/10/2026): una línea por segundo con puerta, reed, ultrasónico, ToF y servo. El JSON sale por UART2 hacia el gateway.</w:t>
       </w:r>
     </w:p>
     <w:p>
@@ -2901,7 +3005,7 @@
         <w:pStyle w:val="Caption"/>
       </w:pPr>
       <w:r>
-        <w:t>Figura 6. Consola del gateway ESP32-C3: cada PUB es un JSON publicado con QoS 1 y su tiempo de publish(); RESUMEN cada 5 s.</w:t>
+        <w:t>Figura 8. Consola del gateway ESP32-C3: cada PUB es un JSON publicado con QoS 1 y su tiempo de publish(); RESUMEN cada 5 s.</w:t>
       </w:r>
     </w:p>
     <w:p>
@@ -2969,7 +3073,7 @@
         <w:pStyle w:val="Caption"/>
       </w:pPr>
       <w:r>
-        <w:t>Figura 7. Consola de FastAPI recibiendo el JSON multivariable desde MQTT.</w:t>
+        <w:t>Figura 9. Consola de FastAPI recibiendo el JSON multivariable desde MQTT.</w:t>
       </w:r>
     </w:p>
     <w:p>
@@ -2982,7 +3086,7 @@
         <w:drawing>
           <wp:inline xmlns:a="http://schemas.openxmlformats.org/drawingml/2006/main" xmlns:pic="http://schemas.openxmlformats.org/drawingml/2006/picture">
             <wp:extent cx="6035040" cy="3243834"/>
-            <wp:docPr id="4" name="Picture 4"/>
+            <wp:docPr id="6" name="Picture 6"/>
             <wp:cNvGraphicFramePr>
               <a:graphicFrameLocks noChangeAspect="1"/>
             </wp:cNvGraphicFramePr>
@@ -2994,7 +3098,7 @@
                     <pic:cNvPicPr/>
                   </pic:nvPicPr>
                   <pic:blipFill>
-                    <a:blip r:embed="rId15"/>
+                    <a:blip r:embed="rId17"/>
                     <a:stretch>
                       <a:fillRect/>
                     </a:stretch>
@@ -3018,7 +3122,7 @@
         <w:pStyle w:val="Caption"/>
       </w:pPr>
       <w:r>
-        <w:t>Figura 8. Experimento 2: cliente WebSocket en el navegador conectado a /ws/telemetria, recibiendo tramas en vivo.</w:t>
+        <w:t>Figura 10. Experimento 2: cliente WebSocket en el navegador conectado a /ws/telemetria, recibiendo tramas en vivo.</w:t>
       </w:r>
     </w:p>
     <w:p>

</xml_diff>